<commit_message>
"Documento terminado - sin CD anexo"
</commit_message>
<xml_diff>
--- a/anexos/Carta de aprobacion.docx
+++ b/anexos/Carta de aprobacion.docx
@@ -7,19 +7,7 @@
         <w:jc w:val="right"/>
       </w:pPr>
       <w:r>
-        <w:t>Cochabamba, 2</w:t>
-      </w:r>
-      <w:r>
-        <w:t>9</w:t>
-      </w:r>
-      <w:r>
-        <w:t xml:space="preserve"> de </w:t>
-      </w:r>
-      <w:r>
-        <w:t xml:space="preserve">abril </w:t>
-      </w:r>
-      <w:r>
-        <w:t>de 2025</w:t>
+        <w:t>Cochabamba, 29 de abril de 2025</w:t>
       </w:r>
     </w:p>
     <w:p/>
@@ -27,13 +15,8 @@
       <w:pPr>
         <w:spacing w:before="120" w:after="120" w:line="240" w:lineRule="auto"/>
       </w:pPr>
-      <w:proofErr w:type="spellStart"/>
-      <w:r>
-        <w:t>MSc</w:t>
-      </w:r>
-      <w:proofErr w:type="spellEnd"/>
-      <w:r>
-        <w:t xml:space="preserve">. Ing. Ronald Patiño Tito </w:t>
+      <w:r>
+        <w:t xml:space="preserve">MSc. Ing. Ronald Patiño Tito </w:t>
       </w:r>
     </w:p>
     <w:p>
@@ -49,53 +32,7 @@
           <w:b/>
           <w:bCs/>
         </w:rPr>
-        <w:t xml:space="preserve">DIRECTOR </w:t>
-      </w:r>
-      <w:proofErr w:type="spellStart"/>
-      <w:r>
-        <w:rPr>
-          <w:b/>
-          <w:bCs/>
-        </w:rPr>
-        <w:t>a.i.</w:t>
-      </w:r>
-      <w:proofErr w:type="spellEnd"/>
-      <w:r>
-        <w:rPr>
-          <w:b/>
-          <w:bCs/>
-        </w:rPr>
-        <w:t xml:space="preserve"> POSGRADO </w:t>
-      </w:r>
-      <w:proofErr w:type="spellStart"/>
-      <w:r>
-        <w:rPr>
-          <w:b/>
-          <w:bCs/>
-        </w:rPr>
-        <w:t>F</w:t>
-      </w:r>
-      <w:r>
-        <w:rPr>
-          <w:b/>
-          <w:bCs/>
-        </w:rPr>
-        <w:t>Cy</w:t>
-      </w:r>
-      <w:r>
-        <w:rPr>
-          <w:b/>
-          <w:bCs/>
-        </w:rPr>
-        <w:t>T</w:t>
-      </w:r>
-      <w:proofErr w:type="spellEnd"/>
-      <w:r>
-        <w:rPr>
-          <w:b/>
-          <w:bCs/>
-        </w:rPr>
-        <w:t xml:space="preserve"> </w:t>
+        <w:t xml:space="preserve">DIRECTOR a.i. POSGRADO FCyT </w:t>
       </w:r>
     </w:p>
     <w:p>
@@ -122,13 +59,7 @@
         <w:jc w:val="center"/>
       </w:pPr>
       <w:r>
-        <w:t>REF</w:t>
-      </w:r>
-      <w:r>
-        <w:t>.-</w:t>
-      </w:r>
-      <w:r>
-        <w:t xml:space="preserve"> APROBACION DE PROYECTO</w:t>
+        <w:t>REF.- APROBACION DE PROYECTO</w:t>
       </w:r>
     </w:p>
     <w:p>
@@ -142,34 +73,7 @@
         <w:jc w:val="both"/>
       </w:pPr>
       <w:r>
-        <w:t xml:space="preserve">Mediante la presente informar a su autoridad que el proyecto titulado </w:t>
-      </w:r>
-      <w:r>
-        <w:t>“OPTIMIZACIÓN DE HORARIOS MEDIANTE ALGORITMOS GENÉTICOS”</w:t>
-      </w:r>
-      <w:r>
-        <w:t xml:space="preserve">. Desarrollado por el estudiante </w:t>
-      </w:r>
-      <w:r>
-        <w:t>ANDREW JEREMIAH HERRADA VILLARROEL</w:t>
-      </w:r>
-      <w:r>
-        <w:t xml:space="preserve"> correspondiente al programa de diplomado "</w:t>
-      </w:r>
-      <w:r>
-        <w:t>Ciencia de Datos</w:t>
-      </w:r>
-      <w:r>
-        <w:t xml:space="preserve">", </w:t>
-      </w:r>
-      <w:r>
-        <w:t>2</w:t>
-      </w:r>
-      <w:r>
-        <w:t>° V, HA SIDO GUIADO EN SU ELABORACIÓN, REVISADO y al contener un perfil, marco teórico, metodología, aplicación, resultados, conclusiones y recomendaciones correctamente elaboradas con un alcance acorde al grado de licenciatura, en mi calidad de Lic. en Informática, con conocimiento de la temática, tengo a bien informar que el mismo está APROBADO</w:t>
-      </w:r>
-      <w:r>
-        <w:t>.</w:t>
+        <w:t>Mediante la presente informar a su autoridad que el proyecto titulado “OPTIMIZACIÓN DE HORARIOS MEDIANTE ALGORITMOS GENÉTICOS”. Desarrollado por el estudiante ANDREW JEREMIAH HERRADA VILLARROEL correspondiente al programa de diplomado "Ciencia de Datos", 2° V, HA SIDO GUIADO EN SU ELABORACIÓN, REVISADO y al contener un perfil, marco teórico, metodología, aplicación, resultados, conclusiones y recomendaciones correctamente elaboradas con un alcance acorde al grado de licenciatura, en mi calidad de Lic. en Informática, con conocimiento de la temática, tengo a bien informar que el mismo está APROBADO.</w:t>
       </w:r>
     </w:p>
     <w:p>
@@ -178,10 +82,7 @@
         <w:jc w:val="both"/>
       </w:pPr>
       <w:r>
-        <w:t>Solicito se me comunique con antelación la fecha y hora de la defensa pública para garantizar m presencia en el acto</w:t>
-      </w:r>
-      <w:r>
-        <w:t>.</w:t>
+        <w:t>Solicito se me comunique con antelación la fecha y hora de la defensa pública para garantizar m presencia en el acto.</w:t>
       </w:r>
     </w:p>
     <w:p>
@@ -190,16 +91,7 @@
         <w:jc w:val="both"/>
       </w:pPr>
       <w:r>
-        <w:t xml:space="preserve">Sin otro particular, </w:t>
-      </w:r>
-      <w:r>
-        <w:t>envío</w:t>
-      </w:r>
-      <w:r>
-        <w:t xml:space="preserve"> saludos cordiales</w:t>
-      </w:r>
-      <w:r>
-        <w:t>.</w:t>
+        <w:t>Sin otro particular, envío saludos cordiales.</w:t>
       </w:r>
     </w:p>
     <w:p>
@@ -240,21 +132,8 @@
         <w:jc w:val="center"/>
       </w:pPr>
       <w:r>
-        <w:t xml:space="preserve">Lic. Carmen Rosa </w:t>
-      </w:r>
-      <w:proofErr w:type="spellStart"/>
-      <w:r>
-        <w:t>Garcia</w:t>
-      </w:r>
-      <w:proofErr w:type="spellEnd"/>
-      <w:r>
-        <w:t xml:space="preserve"> </w:t>
-      </w:r>
-      <w:proofErr w:type="spellStart"/>
-      <w:r>
-        <w:t>Perez</w:t>
-      </w:r>
-      <w:proofErr w:type="spellEnd"/>
+        <w:t>Lic. Carmen Rosa Garcia Perez</w:t>
+      </w:r>
     </w:p>
     <w:p>
       <w:pPr>
@@ -271,7 +150,10 @@
         <w:jc w:val="center"/>
       </w:pPr>
       <w:r>
-        <w:t xml:space="preserve">Telf.: </w:t>
+        <w:t>carmen.garcia.p@fcyt.umss.edu.bo</w:t>
+      </w:r>
+      <w:r>
+        <w:t xml:space="preserve"> </w:t>
       </w:r>
     </w:p>
     <w:sectPr>

</xml_diff>